<commit_message>
Update portfolio contact and education details
</commit_message>
<xml_diff>
--- a/assets/Yaswanth_Raju_Resume_Updated.docx
+++ b/assets/Yaswanth_Raju_Resume_Updated.docx
@@ -29,7 +29,7 @@
           <w:color w:val="444444"/>
           <w:sz w:val="18"/>
         </w:rPr>
-        <w:t>yaswanthraju.konduru123@gmail.com | 9392423929 | Bangalore, India | LinkedIn | GitHub</w:t>
+        <w:t>yaswanthraju.konduru123@gmail.com | 9XXXXXXXXX | Bangalore, India | LinkedIn | GitHub</w:t>
       </w:r>
     </w:p>
     <w:p>
@@ -57,7 +57,7 @@
           <w:color w:val="222222"/>
           <w:sz w:val="18"/>
         </w:rPr>
-        <w:t>Computer Science Engineering student specializing in Artificial Intelligence and Machine Learning. Skilled in Python, JavaScript, web development, data analysis, and machine learning model development. Experienced in building CNN-based classification systems, AI automation workflows, dashboards, and cybersecurity-focused ML solutions.</w:t>
+        <w:t>Computer Science Engineering graduate specializing in Artificial Intelligence and Machine Learning. Skilled in Python, JavaScript, web development, data analysis, and machine learning model development. Experienced in building CNN-based classification systems, AI automation workflows, dashboards, and cybersecurity-focused ML solutions.</w:t>
       </w:r>
     </w:p>
     <w:p>
@@ -667,7 +667,7 @@
           <w:color w:val="222222"/>
           <w:sz w:val="18"/>
         </w:rPr>
-        <w:t>CMR University, Bangalore | CGPA: 8.94 / 10 up to 6th semester | 2022 - 2026</w:t>
+        <w:t>CMR University, Bangalore | CGPA: 8.97 / 10 | Completed | 2022 - 2026</w:t>
       </w:r>
     </w:p>
     <w:p>

</xml_diff>